<commit_message>
docs: finalize report and README with live project links
</commit_message>
<xml_diff>
--- a/docs/IFQ636_A1_Report_OsamaMohamed.docx
+++ b/docs/IFQ636_A1_Report_OsamaMohamed.docx
@@ -92,7 +92,7 @@
           </w:tcPr>
           <w:p>
             <w:r>
-              <w:t>&lt;&lt;INSERT diagrams.net share link&gt;&gt;</w:t>
+              <w:t>github.com/osama-m-qut/medication-reminder-system/blob/main/docs/sysml-diagrams.drawio (open at app.diagrams.net)</w:t>
             </w:r>
           </w:p>
         </w:tc>
@@ -114,7 +114,7 @@
           </w:tcPr>
           <w:p>
             <w:r>
-              <w:t>&lt;&lt;INSERT Jira board URL&gt;&gt;</w:t>
+              <w:t>https://nomadsps.atlassian.net/jira/software/projects/MRS/boards/</w:t>
             </w:r>
           </w:p>
         </w:tc>
@@ -136,7 +136,7 @@
           </w:tcPr>
           <w:p>
             <w:r>
-              <w:t>&lt;&lt;INSERT Figma prototype link&gt;&gt;</w:t>
+              <w:t>https://www.figma.com/design/eOTBAmuSM5tgCKIcsGb490</w:t>
             </w:r>
           </w:p>
         </w:tc>
@@ -158,7 +158,7 @@
           </w:tcPr>
           <w:p>
             <w:r>
-              <w:t>&lt;&lt;INSERT e.g. MediRemind-EC2 / i-0abc123...&gt;&gt;</w:t>
+              <w:t>MediRemind-EC2 / i-0a217255a436bf02d (Public IP 3.27.69.84)</w:t>
             </w:r>
           </w:p>
         </w:tc>
@@ -180,7 +180,7 @@
           </w:tcPr>
           <w:p>
             <w:r>
-              <w:t>&lt;&lt;INSERT GitHub repository URL&gt;&gt;</w:t>
+              <w:t>https://github.com/osama-m-qut/medication-reminder-system</w:t>
             </w:r>
           </w:p>
         </w:tc>
@@ -586,7 +586,7 @@
           <w:i/>
           <w:color w:val="C00000"/>
         </w:rPr>
-        <w:t>[SCREENSHOT] Insert screenshot of http://&lt;EC2_PUBLIC_IP&gt;:5001 in the browser with the public IP highlighted.</w:t>
+        <w:t>[SCREENSHOT] Insert screenshot of http://3.27.69.84:5001 in the browser with the public IP highlighted.</w:t>
       </w:r>
     </w:p>
     <w:p>

</xml_diff>

<commit_message>
docs: disclose AI help with CI/CD pipeline and in-VS Code code generation
</commit_message>
<xml_diff>
--- a/docs/IFQ636_A1_Report_OsamaMohamed.docx
+++ b/docs/IFQ636_A1_Report_OsamaMohamed.docx
@@ -679,12 +679,20 @@
         <w:pStyle w:val="ListBullet"/>
       </w:pPr>
       <w:r>
-        <w:t>Code snippets and examples: I used Copilot to generate example snippets such as a Mongoose schema, an owner-scoped Express controller and a React form component.</w:t>
+        <w:t>CI/CD pipeline: GitHub Copilot helped me build the CI/CD pipeline - drafting the GitHub Actions workflow that runs the tests, builds the frontend and deploys to EC2 over SSH, and explaining how to configure the production environment and encrypted secrets. Example prompt: 'Write a GitHub Actions workflow that runs Mocha tests, then on push to main builds the React app and deploys it to an EC2 instance via SSH and restarts pm2.'</w:t>
+      </w:r>
+    </w:p>
+    <w:p>
+      <w:pPr>
+        <w:pStyle w:val="ListBullet"/>
+      </w:pPr>
+      <w:r>
+        <w:t>Code snippets and examples (in VS Code): I used GitHub Copilot inside VS Code to generate and auto-complete code as I typed - it suggested and completed snippets such as a Mongoose schema, an owner-scoped Express controller and a React form component, which I accepted, edited and integrated.</w:t>
       </w:r>
     </w:p>
     <w:p>
       <w:r>
-        <w:t>Which parts were influenced: the AI assisted with the initial data-model and folder structure, boilerplate for controllers and components, and it generated the automated test suites. The SysML design, the requirement decomposition, the JIRA plan, the Figma design decisions and the CI/CD and deployment configuration were my own work, informed by the AI's suggestions.</w:t>
+        <w:t>Which parts were influenced: the AI assisted with the initial data-model and folder structure, boilerplate for controllers and components (generated and auto-completed inside VS Code), the automated test suites, and the CI/CD pipeline workflow. The SysML design, the requirement decomposition, the JIRA plan and the Figma design decisions were my own work, informed by the AI's suggestions.</w:t>
       </w:r>
     </w:p>
     <w:p>

</xml_diff>

<commit_message>
docs: disclose AI assistance drafting JIRA epics and user stories
</commit_message>
<xml_diff>
--- a/docs/IFQ636_A1_Report_OsamaMohamed.docx
+++ b/docs/IFQ636_A1_Report_OsamaMohamed.docx
@@ -671,6 +671,14 @@
         <w:pStyle w:val="ListBullet"/>
       </w:pPr>
       <w:r>
+        <w:t>JIRA epics and stories: GitHub Copilot assisted me in drafting the required epics and user stories for the JIRA board, which I then refined and broke down into sub-tasks. Example prompt: 'Draft the epics and user stories (in As a... I want... so that... form) for a medication reminder app covering medications, reminders, dose tracking and an admin console.'</w:t>
+      </w:r>
+    </w:p>
+    <w:p>
+      <w:pPr>
+        <w:pStyle w:val="ListBullet"/>
+      </w:pPr>
+      <w:r>
         <w:t>Automated test suites: GitHub Copilot generated the project's automated test suites for me - the Mocha + Chai + Sinon backend API tests (13 tests, which stub the Mongoose models so they run without a database) and the React Testing Library frontend test. Example prompt: 'Write Mocha and Sinon unit tests for this Express medication controller, stubbing the Mongoose model so no database is needed, and cover the validation and ownership checks.' I then ran the suites and verified that all tests pass.</w:t>
       </w:r>
     </w:p>
@@ -692,7 +700,7 @@
     </w:p>
     <w:p>
       <w:r>
-        <w:t>Which parts were influenced: the AI assisted with the initial data-model and folder structure, boilerplate for controllers and components (generated and auto-completed inside VS Code), the automated test suites, and the CI/CD pipeline workflow. The SysML design, the requirement decomposition, the JIRA plan and the Figma design decisions were my own work, informed by the AI's suggestions.</w:t>
+        <w:t>Which parts were influenced: the AI assisted with the initial data-model and folder structure, boilerplate for controllers and components (generated and auto-completed inside VS Code), the automated test suites, the CI/CD pipeline workflow, and the drafting of the JIRA epics and user stories. The SysML design, the requirement decomposition and the Figma design decisions were my own work, informed by the AI's suggestions; the JIRA backlog and sprint planning were finalised and managed by me.</w:t>
       </w:r>
     </w:p>
     <w:p>

</xml_diff>